<commit_message>
Revise draft KL_261026 and update maxima.html to version 1.26
- Updated the KL_261026 draft to clarify that points now indicate what is missing in the application rather than making requests for supplementation, aligning with judicial procedures.
- Revised maxima.html to reflect the latest changes, including updated statistics in Tabell 5 and 7, ensuring accurate representation of the document's content.
- Incremented version number in README.md to 1.26, documenting the recent revisions and enhancements.
</commit_message>
<xml_diff>
--- a/Fritid/NF/Maxima/Yttrande/Utkast/Utkast_yttrande_over_bemotandet_KL_261026_kort.docx
+++ b/Fritid/NF/Maxima/Yttrande/Utkast/Utkast_yttrande_over_bemotandet_KL_261026_kort.docx
@@ -40,7 +40,7 @@
         <w:t>KL_261021</w:t>
       </w:r>
       <w:r>
-        <w:t xml:space="preserve"> (11 punkter och 7 rader). Det här utkastet bygger på KL_261021 och har tagit in synpunkter som kommit efter den: en ny textversion från en av medlemmarna, och synpunkter på EU:s förordningar om återanvändning av vatten och om restaurering av natur. Ändringarna är: punkt 2 (VA SYDs egna uppgifter om fullmäktigebeslutet), andrahandsyrkandet i inledningen (22 kap. 2 §), punkt 4 (år 2150), punkt 6 (decentraliserade alternativ) och en ny rad i bilagan (EU-förordningarna). Juridiska bedömningar är läsningar av lagtext och inte granskade av jurist. </w:t>
+        <w:t xml:space="preserve"> (11 punkter och 7 rader). Det här utkastet bygger på KL_261021 och har tagit in synpunkter som kommit efter den: en ny textversion från en av medlemmarna, och synpunkter på EU:s förordningar om återanvändning av vatten och om restaurering av natur. Utkastet har därefter reviderats efter ytterligare en synpunkt: punkterna anger nu vad som saknas i ansökan, i stället för att begära komplettering, eftersom det är domstolens sak att förelägga om komplettering om ansökan inte avslås. Punkt 10 har fått en mening om att ett förordnande inte kan meddelas för icke specificerade arbeten, och rad 5a hänvisar till att förordningen redan tagits upp. Övriga ändringar är: punkt 2 (VA SYDs egna uppgifter om fullmäktigebeslutet), andrahandsyrkandet i inledningen (22 kap. 2 §), punkt 4 (år 2150), punkt 6 (decentraliserade alternativ) och en ny rad i bilagan (EU-förordningarna). Juridiska bedömningar är läsningar av lagtext och inte granskade av jurist. </w:t>
       </w:r>
       <w:r>
         <w:rPr>
@@ -195,7 +195,7 @@
           <w:b w:val="0"/>
           <w:highlight w:val="yellow"/>
         </w:rPr>
-        <w:t>Varje punkt anger vilken fråga och vilket lagrum den gäller, och slutar med vad LNF begär att VA SYD redovisar.</w:t>
+        <w:t>Varje punkt anger vilken fråga och vilket lagrum den gäller, och slutar med vad som saknas i ansökan. Punkterna är skäl för avslag. Det är domstolens sak att avgöra om och vad VA SYD ska föreläggas att komplettera, om ansökan inte avslås.</w:t>
       </w:r>
     </w:p>
     <w:p>
@@ -239,10 +239,10 @@
         <w:rPr>
           <w:b/>
         </w:rPr>
-        <w:t>LNF begär</w:t>
+        <w:t>Det som saknas</w:t>
       </w:r>
       <w:r>
-        <w:t xml:space="preserve"> att VA SYD redovisar dessa effekter för Höjeådalens naturreservat, fridlysta och hotade arter och för kumulativa effekter.</w:t>
+        <w:t xml:space="preserve"> är en redovisning av dessa effekter för Höjeådalens naturreservat, fridlysta och hotade arter och för kumulativa effekter.</w:t>
       </w:r>
     </w:p>
     <w:p>
@@ -261,10 +261,10 @@
         <w:rPr>
           <w:b/>
         </w:rPr>
-        <w:t>LNF begär</w:t>
+        <w:t>Det som saknas</w:t>
       </w:r>
       <w:r>
-        <w:t xml:space="preserve"> att VA SYD förklarar hur effekter som används i bedömningen kan lämnas utanför redovisningen, redovisar vilket underlag om Höje å och naturmiljön som låg till grund för fullmäktiges beslut, och redovisar om nollalternativet förutsätter att Källby läggs ned, och i så fall på vilket underlag (6 kap. 35 § 3).</w:t>
+        <w:t xml:space="preserve"> är en förklaring av hur effekter som används i bedömningen kan lämnas utanför redovisningen, en redovisning av vilket underlag om Höje å och naturmiljön som låg till grund för fullmäktiges beslut, och en redovisning av om nollalternativet förutsätter att Källby läggs ned, och i så fall på vilket underlag (6 kap. 35 § 3).</w:t>
       </w:r>
     </w:p>
     <w:p>
@@ -283,10 +283,10 @@
         <w:rPr>
           <w:b/>
         </w:rPr>
-        <w:t>LNF begär</w:t>
+        <w:t>Det som saknas</w:t>
       </w:r>
       <w:r>
-        <w:t xml:space="preserve"> att VA SYD redovisar de kumulativa effekterna för Lommaområdet och hur de har bedömts mot den måttstocken.</w:t>
+        <w:t xml:space="preserve"> är en redovisning av de kumulativa effekterna för Lommaområdet och av hur de har bedömts mot den måttstocken.</w:t>
       </w:r>
     </w:p>
     <w:p>
@@ -313,10 +313,10 @@
         <w:rPr>
           <w:b/>
         </w:rPr>
-        <w:t>LNF begär</w:t>
+        <w:t>Det som saknas</w:t>
       </w:r>
       <w:r>
-        <w:t xml:space="preserve"> att VA SYD anger när bygget avslutas, redovisar var i vägledningen nivån +3,5 m och år 2100 anges, och bemöter LNF:s beräkning.</w:t>
+        <w:t xml:space="preserve"> är uppgift om när bygget avslutas, en redovisning av var i vägledningen nivån +3,5 m och år 2100 anges, och ett bemötande av LNF:s beräkning.</w:t>
       </w:r>
     </w:p>
     <w:p>
@@ -335,10 +335,10 @@
         <w:rPr>
           <w:b/>
         </w:rPr>
-        <w:t>LNF begär</w:t>
+        <w:t>Det som saknas</w:t>
       </w:r>
       <w:r>
-        <w:t xml:space="preserve"> att VA SYD redovisar hur skyddet kan anpassas över tid.</w:t>
+        <w:t xml:space="preserve"> är en redovisning av hur skyddet kan anpassas över tid.</w:t>
       </w:r>
     </w:p>
     <w:p>
@@ -365,10 +365,10 @@
         <w:rPr>
           <w:b/>
         </w:rPr>
-        <w:t>LNF begär</w:t>
+        <w:t>Det som saknas</w:t>
       </w:r>
       <w:r>
-        <w:t xml:space="preserve"> att VA SYD anger bilaga, avsnitt och sida där alternativet Källby och decentraliserade alternativ har utretts.</w:t>
+        <w:t xml:space="preserve"> är uppgift om bilaga, avsnitt och sida där alternativet Källby och decentraliserade alternativ har utretts.</w:t>
       </w:r>
     </w:p>
     <w:p>
@@ -387,10 +387,10 @@
         <w:rPr>
           <w:b/>
         </w:rPr>
-        <w:t>LNF begär</w:t>
+        <w:t>LNF anser</w:t>
       </w:r>
       <w:r>
-        <w:t xml:space="preserve"> att frågan prövas i detta mål. Om domstolen ändå överväger ett utredningsvillkor yrkar LNF att det kopplas till ett konkret slutligt villkor, har en tidsgräns och beslutas av domstolen.</w:t>
+        <w:t xml:space="preserve"> att frågan ska prövas i detta mål. Om domstolen ändå överväger ett utredningsvillkor yrkar LNF att det kopplas till ett konkret slutligt villkor, har en tidsgräns och beslutas av domstolen.</w:t>
       </w:r>
     </w:p>
     <w:p>
@@ -417,10 +417,10 @@
         <w:rPr>
           <w:b/>
         </w:rPr>
-        <w:t>LNF begär</w:t>
+        <w:t>Det som saknas</w:t>
       </w:r>
       <w:r>
-        <w:t xml:space="preserve"> att VA SYD redovisar var Länsstyrelsen har uttalat sig och på vilken grund.</w:t>
+        <w:t xml:space="preserve"> är en redovisning av var Länsstyrelsen har uttalat sig och på vilken grund.</w:t>
       </w:r>
     </w:p>
     <w:p>
@@ -459,10 +459,10 @@
         <w:rPr>
           <w:b/>
         </w:rPr>
-        <w:t>LNF begär</w:t>
+        <w:t>Det som saknas</w:t>
       </w:r>
       <w:r>
-        <w:t xml:space="preserve"> att VA SYD anger vilka arbeten det gäller och varför de inte kan vänta. Om domstolen ändå meddelar ett förordnande yrkar LNF att det begränsas till namngivna arbeten och förenas med säkerhet. Om VA SYD tecknar avtal om framtida arbeten under handläggningstiden sker det på egen risk.</w:t>
+        <w:t xml:space="preserve"> är uppgift om vilka arbeten det gäller och varför de inte kan vänta. Domstolen kan inte pröva om det finns skäl för ett förordnande för arbeten som inte har specificerats. Om domstolen ändå meddelar ett förordnande yrkar LNF att det begränsas till namngivna arbeten och förenas med säkerhet. Om VA SYD tecknar avtal om framtida arbeten under handläggningstiden sker det på egen risk.</w:t>
       </w:r>
     </w:p>
     <w:p>
@@ -505,7 +505,7 @@
     </w:p>
     <w:p>
       <w:r>
-        <w:t>LNF begär att VA SYD besvarar följande punkter, eller pekar ut var i ansökan de besvaras.</w:t>
+        <w:t>Följande saknas i ansökan eller har inte besvarats i bemötandet. De är skäl för avslag på samma sätt som punkt 1–11.</w:t>
       </w:r>
     </w:p>
     <w:tbl>
@@ -589,7 +589,7 @@
               <w:rPr>
                 <w:b/>
               </w:rPr>
-              <w:t>LNF begär att VA SYD</w:t>
+              <w:t>Det som saknas</w:t>
             </w:r>
           </w:p>
         </w:tc>
@@ -635,7 +635,7 @@
           <w:p>
             <w:r/>
             <w:r>
-              <w:t>redovisar var och när bräddning har skett och vilka mätdata påståendet om ökad bräddning bygger på. LNF har anfört att verkets konstruktion inte tillåter bräddning och att miljörapporterna till och med 2023 inte redovisar någon (aktbilaga 257)</w:t>
+              <w:t>en redovisning av var och när bräddning har skett och vilka mätdata påståendet om ökad bräddning bygger på. LNF har anfört att verkets konstruktion inte tillåter bräddning och att miljörapporterna till och med 2023 inte redovisar någon (aktbilaga 257)</w:t>
             </w:r>
           </w:p>
         </w:tc>
@@ -681,7 +681,7 @@
           <w:p>
             <w:r/>
             <w:r>
-              <w:t>redovisar hur Lunds avloppsvatten renas om taket nås före omkopplingen 2035 (sid. 42)</w:t>
+              <w:t>en redovisning av hur Lunds avloppsvatten renas om taket nås före omkopplingen 2035 (sid. 42)</w:t>
             </w:r>
           </w:p>
         </w:tc>
@@ -727,7 +727,7 @@
           <w:p>
             <w:r/>
             <w:r>
-              <w:t>kompletterar beräkningen med rivning av Borgeby och Källby, eller anger varför den inte ingår</w:t>
+              <w:t>en beräkning som omfattar rivning av Borgeby och Källby, eller uppgift om varför den inte ingår</w:t>
             </w:r>
           </w:p>
         </w:tc>
@@ -773,7 +773,7 @@
           <w:p>
             <w:r/>
             <w:r>
-              <w:t>rättar eller förklarar uppgiften om recipient för Källby</w:t>
+              <w:t>en rättelse eller förklaring av uppgiften om recipient för Källby</w:t>
             </w:r>
           </w:p>
         </w:tc>
@@ -819,7 +819,7 @@
           <w:p>
             <w:r/>
             <w:r>
-              <w:t>jämför ett enda kustnära verk med ett system där Källby bibehålls (6 kap. 35 § 4: miljöeffekter till följd av yttre händelser)</w:t>
+              <w:t>en jämförelse mellan ett enda kustnära verk och ett system där Källby bibehålls (6 kap. 35 § 4: miljöeffekter till följd av yttre händelser)</w:t>
             </w:r>
           </w:p>
         </w:tc>
@@ -865,7 +865,7 @@
           <w:p>
             <w:r/>
             <w:r>
-              <w:t>pekar ut var tunnelns rörelse i höjdled vid Alnarpsströmmen och spridning av PFAS från marker norr om schakt S37 behandlas</w:t>
+              <w:t>uppgift om var tunnelns rörelse i höjdled vid Alnarpsströmmen och spridning av PFAS från marker norr om schakt S37 behandlas</w:t>
             </w:r>
           </w:p>
         </w:tc>
@@ -911,7 +911,7 @@
           <w:p>
             <w:r/>
             <w:r>
-              <w:t>redovisar om återanvändning av renat avloppsvatten har bedömts som alternativ eller hushållningsåtgärd (2 kap. 5 §, 6 kap. 35 § 2), och om berörda livsmiljötyper omfattas av förordning 2024/1991 om att livsmiljötyper i gott tillstånd inte får försämras avsevärt (artikel 4.11–12 och 5.9–10), och i så fall hur ansökan förhåller sig till kraven</w:t>
+              <w:t>en redovisning av om återanvändning av renat avloppsvatten har bedömts som alternativ eller hushållningsåtgärd (2 kap. 5 §, 6 kap. 35 § 2), och av om berörda livsmiljötyper omfattas av förordning 2024/1991 om att livsmiljötyper i gott tillstånd inte får försämras avsevärt (artikel 4.11–12 och 5.9–10) och i så fall hur ansökan förhåller sig till kraven. LNF har tagit upp restaureringsförordningen i samrådssynpunkterna (s. 6) och i aktbilaga 257 (s. 3), men VA SYD svarar inte i sak</w:t>
             </w:r>
           </w:p>
         </w:tc>
@@ -957,7 +957,7 @@
           <w:p>
             <w:r/>
             <w:r>
-              <w:t>redovisar kostnaden för alternativet Källby och det totala elbehovet för pumpning (2 kap. 5 och 7 §§). LNF har anfört att kostnaden för ett utbyggt Källby var upp till 2 miljarder kronor lägre (aktbilaga 257, bilaga 1), vilket kan leda till motsvarande högre va-avgifter för Lunds invånare</w:t>
+              <w:t>en redovisning av kostnaden för alternativet Källby och det totala elbehovet för pumpning (2 kap. 5 och 7 §§). LNF har anfört att kostnaden för ett utbyggt Källby var upp till 2 miljarder kronor lägre (aktbilaga 257, bilaga 1), vilket kan leda till motsvarande högre va-avgifter för Lunds invånare</w:t>
             </w:r>
           </w:p>
         </w:tc>

</xml_diff>

<commit_message>
Update draft KL_261026 and enhance Samrådsguiden content
- Revised the KL_261026 draft to clarify missing elements in the application, improving alignment with judicial procedures.
- Updated `maxima.html` to reflect changes in cost comparisons and ensure accurate representation of financial implications.
- Adjusted statistics in `innehall.html` and `maxima.html` to maintain consistency across documents.
- Enhanced the `sokindex.js` file to ensure updated indexing for improved search functionality.
</commit_message>
<xml_diff>
--- a/Fritid/NF/Maxima/Yttrande/Utkast/Utkast_yttrande_over_bemotandet_KL_261026_kort.docx
+++ b/Fritid/NF/Maxima/Yttrande/Utkast/Utkast_yttrande_over_bemotandet_KL_261026_kort.docx
@@ -957,12 +957,79 @@
           <w:p>
             <w:r/>
             <w:r>
-              <w:t>en redovisning av kostnaden för alternativet Källby och det totala elbehovet för pumpning (2 kap. 5 och 7 §§). LNF har anfört att kostnaden för ett utbyggt Källby var upp till 2 miljarder kronor lägre (aktbilaga 257, bilaga 1), vilket kan leda till motsvarande högre va-avgifter för Lunds invånare</w:t>
+              <w:t>en jämförbar kostnadsredovisning för alternativet Källby och MAXIMA (samma period, prisnivå och omfattning), och en redovisning av det totala elbehovet för pumpning (2 kap. 5 och 7 §§). Kostnadsskillnaden är osäker, se anmärkningen nedan</w:t>
             </w:r>
           </w:p>
         </w:tc>
       </w:tr>
     </w:tbl>
+    <w:p>
+      <w:r/>
+      <w:r>
+        <w:rPr>
+          <w:b/>
+        </w:rPr>
+        <w:t>Anmärkning till rad 2, 8: kostnadsskillnaden.</w:t>
+      </w:r>
+      <w:r>
+        <w:t xml:space="preserve"> LNF har anfört att kostnaden för ett utbyggt Källby var upp till 2 miljarder kronor lägre (aktbilaga 257, s. 1 och 6, bilaga 1). Underlaget kan läsas på olika sätt:</w:t>
+      </w:r>
+    </w:p>
+    <w:p>
+      <w:pPr>
+        <w:pStyle w:val="ListBullet"/>
+      </w:pPr>
+      <w:r>
+        <w:t xml:space="preserve">Slutrapporten </w:t>
+      </w:r>
+      <w:r>
+        <w:rPr>
+          <w:i/>
+        </w:rPr>
+        <w:t>Fortsatt drift eller nedläggning av Källby Avloppsreningsverk</w:t>
+      </w:r>
+      <w:r>
+        <w:t xml:space="preserve"> (2020-09-07, s. 5) bedömer en utbyggnad av Källby till "i storleksordningen 300, maximalt 400, miljoner kronor", men anger att krav på läkemedelsrening kan driva kostnaden högre.</w:t>
+      </w:r>
+    </w:p>
+    <w:p>
+      <w:pPr>
+        <w:pStyle w:val="ListBullet"/>
+      </w:pPr>
+      <w:r>
+        <w:t xml:space="preserve">VA SYD (2021, </w:t>
+      </w:r>
+      <w:r>
+        <w:rPr>
+          <w:i/>
+        </w:rPr>
+        <w:t>Lunds framtida avloppsrening</w:t>
+      </w:r>
+      <w:r>
+        <w:t>, tabell 3, s. 34) anger Lunds investering med Nya Sjölunda till 2 408 Mkr (system 3) och 2 670 Mkr (system 2). Jämfört med slutrapportens 300–400 Mkr blir skillnaden ca 2,0–2,4 miljarder. Det är så uppgiften "upp till 2 miljarder" kan härledas.</w:t>
+      </w:r>
+    </w:p>
+    <w:p>
+      <w:pPr>
+        <w:pStyle w:val="ListBullet"/>
+      </w:pPr>
+      <w:r>
+        <w:t>Räknar man i stället med VA SYD:s och WSP:s egen kalkyl för Källby, ca 1 750–1 800 Mkr (VA SYD, 2021, s. 20; WSP 2020 enligt slutrapporten, s. 3), blir skillnaden ca 0,6–0,9 miljarder. Mot VA SYD:s system 1, där Källby och Södra Sandby behålls (1 916 Mkr), är skillnaden ca 0,5–0,75 miljarder.</w:t>
+      </w:r>
+    </w:p>
+    <w:p>
+      <w:pPr>
+        <w:pStyle w:val="ListBullet"/>
+      </w:pPr>
+      <w:r>
+        <w:t>Siffrorna gäller prisnivå 2020–2021 och är beräkningar av olika slag. VA SYD betecknar sina underlag som preliminära och delvis grundade på schabloner (2021, s. 34). De avser inte den nuvarande ansökan.</w:t>
+      </w:r>
+    </w:p>
+    <w:p>
+      <w:r>
+        <w:t>Skillnaden kan därför vara betydligt mindre än 2 miljarder, och beror på vilket underlag man jämför med. Det som saknas är en jämförbar kostnadsredovisning i den nuvarande ansökan.</w:t>
+      </w:r>
+    </w:p>
     <w:p>
       <w:r>
         <w:t>Lund den        november 2026</w:t>

</xml_diff>